<commit_message>
empecé a editar el capítulo 11
</commit_message>
<xml_diff>
--- a/paciales/1_parcial/parcial_python_matematicas.docx
+++ b/paciales/1_parcial/parcial_python_matematicas.docx
@@ -79,6 +79,38 @@
     </w:p>
     <w:p>
       <w:pPr>
+        <w:rPr>
+          <w:lang w:val="es-CO"/>
+        </w:rPr>
+      </w:pPr>
+    </w:p>
+    <w:p>
+      <w:pPr>
+        <w:rPr>
+          <w:lang w:val="es-CO"/>
+        </w:rPr>
+      </w:pPr>
+      <w:r>
+        <w:rPr>
+          <w:lang w:val="es-CO"/>
+        </w:rPr>
+        <w:t>En cada una de las siguientes preguntas realice:</w:t>
+      </w:r>
+    </w:p>
+    <w:p>
+      <w:pPr>
+        <w:pStyle w:val="Prrafodelista"/>
+        <w:numPr>
+          <w:ilvl w:val="0"/>
+          <w:numId w:val="11"/>
+        </w:numPr>
+        <w:rPr>
+          <w:lang w:val="es-CO"/>
+        </w:rPr>
+      </w:pPr>
+    </w:p>
+    <w:p>
+      <w:pPr>
         <w:pStyle w:val="Prrafodelista"/>
         <w:numPr>
           <w:ilvl w:val="0"/>
@@ -142,7 +174,21 @@
         <w:rPr>
           <w:lang w:val="es-CO"/>
         </w:rPr>
-        <w:t>Escriba en Python: (3^4 - 2^5)/5 e indique el tipo de dato.</w:t>
+        <w:t>Escriba en Python: (3^4 - 2^</w:t>
+      </w:r>
+      <w:proofErr w:type="gramStart"/>
+      <w:r>
+        <w:rPr>
+          <w:lang w:val="es-CO"/>
+        </w:rPr>
+        <w:t>5)/</w:t>
+      </w:r>
+      <w:proofErr w:type="gramEnd"/>
+      <w:r>
+        <w:rPr>
+          <w:lang w:val="es-CO"/>
+        </w:rPr>
+        <w:t>5 e indique el tipo de dato.</w:t>
       </w:r>
     </w:p>
     <w:p>
@@ -192,7 +238,29 @@
         <w:rPr>
           <w:lang w:val="es-CO"/>
         </w:rPr>
-        <w:t>Sea a = sqrt(49) y b = 7. Verifique si a =</w:t>
+        <w:t xml:space="preserve">Sea a = </w:t>
+      </w:r>
+      <w:proofErr w:type="spellStart"/>
+      <w:proofErr w:type="gramStart"/>
+      <w:r>
+        <w:rPr>
+          <w:lang w:val="es-CO"/>
+        </w:rPr>
+        <w:t>sqrt</w:t>
+      </w:r>
+      <w:proofErr w:type="spellEnd"/>
+      <w:r>
+        <w:rPr>
+          <w:lang w:val="es-CO"/>
+        </w:rPr>
+        <w:t>(</w:t>
+      </w:r>
+      <w:proofErr w:type="gramEnd"/>
+      <w:r>
+        <w:rPr>
+          <w:lang w:val="es-CO"/>
+        </w:rPr>
+        <w:t>49) y b = 7. Verifique si a =</w:t>
       </w:r>
       <w:r>
         <w:rPr>
@@ -480,7 +548,35 @@
         <w:rPr>
           <w:lang w:val="es-CO"/>
         </w:rPr>
-        <w:t>f(x)=(x^2+1)/(x-1). Calcular f(3).</w:t>
+        <w:t>f(x)=(x^2+</w:t>
+      </w:r>
+      <w:proofErr w:type="gramStart"/>
+      <w:r>
+        <w:rPr>
+          <w:lang w:val="es-CO"/>
+        </w:rPr>
+        <w:t>1)/</w:t>
+      </w:r>
+      <w:proofErr w:type="gramEnd"/>
+      <w:r>
+        <w:rPr>
+          <w:lang w:val="es-CO"/>
+        </w:rPr>
+        <w:t xml:space="preserve">(x-1). Calcular </w:t>
+      </w:r>
+      <w:proofErr w:type="gramStart"/>
+      <w:r>
+        <w:rPr>
+          <w:lang w:val="es-CO"/>
+        </w:rPr>
+        <w:t>f(</w:t>
+      </w:r>
+      <w:proofErr w:type="gramEnd"/>
+      <w:r>
+        <w:rPr>
+          <w:lang w:val="es-CO"/>
+        </w:rPr>
+        <w:t>3).</w:t>
       </w:r>
     </w:p>
     <w:p>
@@ -530,7 +626,29 @@
         <w:rPr>
           <w:lang w:val="es-CO"/>
         </w:rPr>
-        <w:t>Usar // para floor(27/4).</w:t>
+        <w:t xml:space="preserve">Usar // para </w:t>
+      </w:r>
+      <w:proofErr w:type="spellStart"/>
+      <w:proofErr w:type="gramStart"/>
+      <w:r>
+        <w:rPr>
+          <w:lang w:val="es-CO"/>
+        </w:rPr>
+        <w:t>floor</w:t>
+      </w:r>
+      <w:proofErr w:type="spellEnd"/>
+      <w:r>
+        <w:rPr>
+          <w:lang w:val="es-CO"/>
+        </w:rPr>
+        <w:t>(</w:t>
+      </w:r>
+      <w:proofErr w:type="gramEnd"/>
+      <w:r>
+        <w:rPr>
+          <w:lang w:val="es-CO"/>
+        </w:rPr>
+        <w:t>27/4).</w:t>
       </w:r>
     </w:p>
     <w:p>
@@ -630,7 +748,21 @@
         <w:rPr>
           <w:lang w:val="es-CO"/>
         </w:rPr>
-        <w:t>f(x)=x^2-4. Verifique si f(3) &gt; 0.</w:t>
+        <w:t xml:space="preserve">f(x)=x^2-4. Verifique si </w:t>
+      </w:r>
+      <w:proofErr w:type="gramStart"/>
+      <w:r>
+        <w:rPr>
+          <w:lang w:val="es-CO"/>
+        </w:rPr>
+        <w:t>f(</w:t>
+      </w:r>
+      <w:proofErr w:type="gramEnd"/>
+      <w:r>
+        <w:rPr>
+          <w:lang w:val="es-CO"/>
+        </w:rPr>
+        <w:t>3) &gt; 0.</w:t>
       </w:r>
     </w:p>
     <w:p>
@@ -780,6 +912,7 @@
         <w:rPr>
           <w:lang w:val="es-CO"/>
         </w:rPr>
+        <w:lastRenderedPageBreak/>
         <w:t>f(x)=sin(x). Con x=0 verifique si f(x)=0.</w:t>
       </w:r>
     </w:p>
@@ -830,7 +963,6 @@
         <w:rPr>
           <w:lang w:val="es-CO"/>
         </w:rPr>
-        <w:lastRenderedPageBreak/>
         <w:t>a=5, b=7. Verifique si a^2 &gt; b.</w:t>
       </w:r>
     </w:p>
@@ -981,7 +1113,35 @@
         <w:rPr>
           <w:lang w:val="es-CO"/>
         </w:rPr>
-        <w:t>f(x)=x^2-9. Verifique si f(4)&gt;0 y f(-4)&gt;0.</w:t>
+        <w:t xml:space="preserve">f(x)=x^2-9. Verifique si </w:t>
+      </w:r>
+      <w:proofErr w:type="gramStart"/>
+      <w:r>
+        <w:rPr>
+          <w:lang w:val="es-CO"/>
+        </w:rPr>
+        <w:t>f(</w:t>
+      </w:r>
+      <w:proofErr w:type="gramEnd"/>
+      <w:r>
+        <w:rPr>
+          <w:lang w:val="es-CO"/>
+        </w:rPr>
+        <w:t xml:space="preserve">4)&gt;0 y </w:t>
+      </w:r>
+      <w:proofErr w:type="gramStart"/>
+      <w:r>
+        <w:rPr>
+          <w:lang w:val="es-CO"/>
+        </w:rPr>
+        <w:t>f(</w:t>
+      </w:r>
+      <w:proofErr w:type="gramEnd"/>
+      <w:r>
+        <w:rPr>
+          <w:lang w:val="es-CO"/>
+        </w:rPr>
+        <w:t>-4)&gt;0.</w:t>
       </w:r>
     </w:p>
     <w:p>
@@ -1031,7 +1191,35 @@
         <w:rPr>
           <w:lang w:val="es-CO"/>
         </w:rPr>
-        <w:t>Verifique desigualdad triangular con a=3,b=4,c=5.</w:t>
+        <w:t>Verifique desigualdad triangular con a=</w:t>
+      </w:r>
+      <w:proofErr w:type="gramStart"/>
+      <w:r>
+        <w:rPr>
+          <w:lang w:val="es-CO"/>
+        </w:rPr>
+        <w:t>3,b</w:t>
+      </w:r>
+      <w:proofErr w:type="gramEnd"/>
+      <w:r>
+        <w:rPr>
+          <w:lang w:val="es-CO"/>
+        </w:rPr>
+        <w:t>=</w:t>
+      </w:r>
+      <w:proofErr w:type="gramStart"/>
+      <w:r>
+        <w:rPr>
+          <w:lang w:val="es-CO"/>
+        </w:rPr>
+        <w:t>4,c</w:t>
+      </w:r>
+      <w:proofErr w:type="gramEnd"/>
+      <w:r>
+        <w:rPr>
+          <w:lang w:val="es-CO"/>
+        </w:rPr>
+        <w:t>=5.</w:t>
       </w:r>
     </w:p>
     <w:p>
@@ -1139,7 +1327,21 @@
         <w:rPr>
           <w:lang w:val="es-CO"/>
         </w:rPr>
-        <w:t>Lista con f(x)=x^2 para x=1..5.</w:t>
+        <w:t>Lista con f(x)=x^2 para x=</w:t>
+      </w:r>
+      <w:proofErr w:type="gramStart"/>
+      <w:r>
+        <w:rPr>
+          <w:lang w:val="es-CO"/>
+        </w:rPr>
+        <w:t>1..</w:t>
+      </w:r>
+      <w:proofErr w:type="gramEnd"/>
+      <w:r>
+        <w:rPr>
+          <w:lang w:val="es-CO"/>
+        </w:rPr>
+        <w:t>5.</w:t>
       </w:r>
     </w:p>
     <w:p>
@@ -1189,7 +1391,21 @@
         <w:rPr>
           <w:lang w:val="es-CO"/>
         </w:rPr>
-        <w:t>A=[1,4,9,16,25]. Interprete y agregue el siguiente valor.</w:t>
+        <w:t>A</w:t>
+      </w:r>
+      <w:proofErr w:type="gramStart"/>
+      <w:r>
+        <w:rPr>
+          <w:lang w:val="es-CO"/>
+        </w:rPr>
+        <w:t>=[</w:t>
+      </w:r>
+      <w:proofErr w:type="gramEnd"/>
+      <w:r>
+        <w:rPr>
+          <w:lang w:val="es-CO"/>
+        </w:rPr>
+        <w:t>1,4,9,16,25]. Interprete y agregue el siguiente valor.</w:t>
       </w:r>
     </w:p>
     <w:p>
@@ -1255,8 +1471,49 @@
         <w:rPr>
           <w:lang w:val="es-CO"/>
         </w:rPr>
-        <w:lastRenderedPageBreak/>
-        <w:t>Lista con puntos (0,0),(1,1),(2,4),(3,9).</w:t>
+        <w:t>Lista con puntos (0,0</w:t>
+      </w:r>
+      <w:proofErr w:type="gramStart"/>
+      <w:r>
+        <w:rPr>
+          <w:lang w:val="es-CO"/>
+        </w:rPr>
+        <w:t>),(</w:t>
+      </w:r>
+      <w:proofErr w:type="gramEnd"/>
+      <w:r>
+        <w:rPr>
+          <w:lang w:val="es-CO"/>
+        </w:rPr>
+        <w:t>1,1</w:t>
+      </w:r>
+      <w:proofErr w:type="gramStart"/>
+      <w:r>
+        <w:rPr>
+          <w:lang w:val="es-CO"/>
+        </w:rPr>
+        <w:t>),(</w:t>
+      </w:r>
+      <w:proofErr w:type="gramEnd"/>
+      <w:r>
+        <w:rPr>
+          <w:lang w:val="es-CO"/>
+        </w:rPr>
+        <w:t>2,4</w:t>
+      </w:r>
+      <w:proofErr w:type="gramStart"/>
+      <w:r>
+        <w:rPr>
+          <w:lang w:val="es-CO"/>
+        </w:rPr>
+        <w:t>),(</w:t>
+      </w:r>
+      <w:proofErr w:type="gramEnd"/>
+      <w:r>
+        <w:rPr>
+          <w:lang w:val="es-CO"/>
+        </w:rPr>
+        <w:t>3,9).</w:t>
       </w:r>
     </w:p>
     <w:p>
@@ -1306,7 +1563,21 @@
         <w:rPr>
           <w:lang w:val="es-CO"/>
         </w:rPr>
-        <w:t>Tupla v=(3,-2,5) y calcule su norma.</w:t>
+        <w:t>Tupla v</w:t>
+      </w:r>
+      <w:proofErr w:type="gramStart"/>
+      <w:r>
+        <w:rPr>
+          <w:lang w:val="es-CO"/>
+        </w:rPr>
+        <w:t>=(</w:t>
+      </w:r>
+      <w:proofErr w:type="gramEnd"/>
+      <w:r>
+        <w:rPr>
+          <w:lang w:val="es-CO"/>
+        </w:rPr>
+        <w:t>3,-2,5) y calcule su norma.</w:t>
       </w:r>
     </w:p>
     <w:p>
@@ -1359,7 +1630,35 @@
         <w:rPr>
           <w:lang w:val="es-CO"/>
         </w:rPr>
-        <w:t>25. Conjuntos A={1,2,3,4}, B={3,4,5,6}. Halle unión, intersección y A-B.</w:t>
+        <w:t>25. Conjuntos A</w:t>
+      </w:r>
+      <w:proofErr w:type="gramStart"/>
+      <w:r>
+        <w:rPr>
+          <w:lang w:val="es-CO"/>
+        </w:rPr>
+        <w:t>={</w:t>
+      </w:r>
+      <w:proofErr w:type="gramEnd"/>
+      <w:r>
+        <w:rPr>
+          <w:lang w:val="es-CO"/>
+        </w:rPr>
+        <w:t>1,2,3,4}, B</w:t>
+      </w:r>
+      <w:proofErr w:type="gramStart"/>
+      <w:r>
+        <w:rPr>
+          <w:lang w:val="es-CO"/>
+        </w:rPr>
+        <w:t>={</w:t>
+      </w:r>
+      <w:proofErr w:type="gramEnd"/>
+      <w:r>
+        <w:rPr>
+          <w:lang w:val="es-CO"/>
+        </w:rPr>
+        <w:t>3,4,5,6}. Halle unión, intersección y A-B.</w:t>
       </w:r>
     </w:p>
     <w:sectPr>
@@ -1552,6 +1851,95 @@
     <w:lvl w:ilvl="0" w:tplc="240A000F">
       <w:start w:val="1"/>
       <w:numFmt w:val="decimal"/>
+      <w:lvlText w:val="%1."/>
+      <w:lvlJc w:val="left"/>
+      <w:pPr>
+        <w:ind w:left="720" w:hanging="360"/>
+      </w:pPr>
+      <w:rPr>
+        <w:rFonts w:hint="default"/>
+      </w:rPr>
+    </w:lvl>
+    <w:lvl w:ilvl="1" w:tplc="240A0019" w:tentative="1">
+      <w:start w:val="1"/>
+      <w:numFmt w:val="lowerLetter"/>
+      <w:lvlText w:val="%2."/>
+      <w:lvlJc w:val="left"/>
+      <w:pPr>
+        <w:ind w:left="1440" w:hanging="360"/>
+      </w:pPr>
+    </w:lvl>
+    <w:lvl w:ilvl="2" w:tplc="240A001B" w:tentative="1">
+      <w:start w:val="1"/>
+      <w:numFmt w:val="lowerRoman"/>
+      <w:lvlText w:val="%3."/>
+      <w:lvlJc w:val="right"/>
+      <w:pPr>
+        <w:ind w:left="2160" w:hanging="180"/>
+      </w:pPr>
+    </w:lvl>
+    <w:lvl w:ilvl="3" w:tplc="240A000F" w:tentative="1">
+      <w:start w:val="1"/>
+      <w:numFmt w:val="decimal"/>
+      <w:lvlText w:val="%4."/>
+      <w:lvlJc w:val="left"/>
+      <w:pPr>
+        <w:ind w:left="2880" w:hanging="360"/>
+      </w:pPr>
+    </w:lvl>
+    <w:lvl w:ilvl="4" w:tplc="240A0019" w:tentative="1">
+      <w:start w:val="1"/>
+      <w:numFmt w:val="lowerLetter"/>
+      <w:lvlText w:val="%5."/>
+      <w:lvlJc w:val="left"/>
+      <w:pPr>
+        <w:ind w:left="3600" w:hanging="360"/>
+      </w:pPr>
+    </w:lvl>
+    <w:lvl w:ilvl="5" w:tplc="240A001B" w:tentative="1">
+      <w:start w:val="1"/>
+      <w:numFmt w:val="lowerRoman"/>
+      <w:lvlText w:val="%6."/>
+      <w:lvlJc w:val="right"/>
+      <w:pPr>
+        <w:ind w:left="4320" w:hanging="180"/>
+      </w:pPr>
+    </w:lvl>
+    <w:lvl w:ilvl="6" w:tplc="240A000F" w:tentative="1">
+      <w:start w:val="1"/>
+      <w:numFmt w:val="decimal"/>
+      <w:lvlText w:val="%7."/>
+      <w:lvlJc w:val="left"/>
+      <w:pPr>
+        <w:ind w:left="5040" w:hanging="360"/>
+      </w:pPr>
+    </w:lvl>
+    <w:lvl w:ilvl="7" w:tplc="240A0019" w:tentative="1">
+      <w:start w:val="1"/>
+      <w:numFmt w:val="lowerLetter"/>
+      <w:lvlText w:val="%8."/>
+      <w:lvlJc w:val="left"/>
+      <w:pPr>
+        <w:ind w:left="5760" w:hanging="360"/>
+      </w:pPr>
+    </w:lvl>
+    <w:lvl w:ilvl="8" w:tplc="240A001B" w:tentative="1">
+      <w:start w:val="1"/>
+      <w:numFmt w:val="lowerRoman"/>
+      <w:lvlText w:val="%9."/>
+      <w:lvlJc w:val="right"/>
+      <w:pPr>
+        <w:ind w:left="6480" w:hanging="180"/>
+      </w:pPr>
+    </w:lvl>
+  </w:abstractNum>
+  <w:abstractNum w:abstractNumId="10" w15:restartNumberingAfterBreak="0">
+    <w:nsid w:val="6E3960E4"/>
+    <w:multiLevelType w:val="hybridMultilevel"/>
+    <w:tmpl w:val="FA9A850C"/>
+    <w:lvl w:ilvl="0" w:tplc="240A0019">
+      <w:start w:val="1"/>
+      <w:numFmt w:val="lowerLetter"/>
       <w:lvlText w:val="%1."/>
       <w:lvlJc w:val="left"/>
       <w:pPr>
@@ -1663,6 +2051,9 @@
   </w:num>
   <w:num w:numId="10" w16cid:durableId="825705069">
     <w:abstractNumId w:val="9"/>
+  </w:num>
+  <w:num w:numId="11" w16cid:durableId="82919721">
+    <w:abstractNumId w:val="10"/>
   </w:num>
 </w:numbering>
 </file>

</xml_diff>